<commit_message>
Notebooks y observaciones latencia idiomas
</commit_message>
<xml_diff>
--- a/observaciones/observaciones_latencia_streaming.docx
+++ b/observaciones/observaciones_latencia_streaming.docx
@@ -51,7 +51,7 @@
     </w:p>
     <w:p>
       <w:r>
-        <w:t>Cada modelo tiene un parámetro que controla la latencia, aunque funcionan de forma distinta. En Voxtral es transcription_delay_ms, que por defecto vale 480 ms, equivalentes a seis tokens de retardo a razón de 80 ms por token; el audio se consume en fragmentos fijos de 105 ms. En Qwen3-ASR es chunk_size_sec, el bloque de audio que debe acumularse antes de emitir una nueva hipótesis, que por defecto vale 2 segundos. Conviene señalar que, con los valores por defecto, Voxtral trabaja a 480 ms y Qwen3-ASR a 2.000 ms, así que las comparaciones anteriores entre ambos no eran homogéneas.</w:t>
+        <w:t>Cada modelo tiene un parámetro que controla la latencia, aunque funcionan de forma distinta. En Voxtral es transcription_delay_ms, que por defecto vale 480 ms, equivalentes a seis tokens de retardo a razón de 80 ms por token; admite múltiplos de 80 ms entre 80 y 1.200, más el valor suelto de 2.400, y el audio se consume en fragmentos fijos de 105 ms. En Qwen3-ASR es chunk_size_sec, el bloque de audio que debe acumularse antes de emitir una nueva hipótesis, que por defecto vale 2 segundos. Conviene señalar que, con los valores por defecto, Voxtral trabaja a 480 ms y Qwen3-ASR a 2.000 ms, así que las comparaciones anteriores entre ambos no eran homogéneas.</w:t>
       </w:r>
     </w:p>
     <w:p>
@@ -1043,7 +1043,7 @@
           <w:color w:val="606060"/>
           <w:sz w:val="17"/>
         </w:rPr>
-        <w:t>Uso del bloque: porcentaje de los 105 ms de cada fragmento que se consume en cómputo. Anómalos: transcripciones que miden menos de la mitad o más de 1,6 veces la referencia.</w:t>
+        <w:t>Uso del bloque: porcentaje de los 105 ms de cada fragmento que se consume en cómputo. Anómalos: transcripciones que miden menos de la mitad o más de 1,6 veces la referencia. El valor de 1.920 ms queda fuera del rango admitido por el modelo (múltiplos de 80 ms hasta 1.200, más 2.400) y se incluye solo a efectos informativos.</w:t>
       </w:r>
     </w:p>
     <w:p>
@@ -1058,7 +1058,17 @@
     </w:p>
     <w:p>
       <w:r>
-        <w:t>Las tasas altas de 320 y 1.920 ms no se deben a un mal reconocimiento, sino a transcripciones truncadas, en las que el modelo corta la generación antes de terminar la intervención, se para a mitad de frase y remata con una fórmula de cierre, lo que apunta a que emite el token de fin antes de tiempo. El problema se concentra en cuatro audios concretos y no sigue un patrón claro respecto del retardo: la configuración de 320 ms trunca más que la de 160 ms, y la de 960 ms no trunca ninguno mientras que la de 1.920 ms trunca tres. Un mismo audio puede transcribirse bien con 480 y 960 ms y truncarse con 160, 320 y 1.920 ms. No hemos determinado el mecanismo. Una hipótesis posible es que cambiar el retardo en el momento de la inferencia no sea un uso previsto del modelo, ya que ese parámetro afecta tanto a los embeddings temporales como al relleno que se añade al final del audio, pero no está verificada.</w:t>
+        <w:t>Las tasas altas de 320 y 1.920 ms no se deben a un mal reconocimiento, sino a transcripciones truncadas, en las que el modelo corta la generación antes de terminar la intervención, se para a mitad de frase y remata con una fórmula de cierre, lo que apunta a que emite el token de fin antes de tiempo.</w:t>
+      </w:r>
+    </w:p>
+    <w:p>
+      <w:r>
+        <w:t>En el caso de 1.920 ms hay una explicación clara: ese valor está fuera de lo que el modelo admite. La ficha oficial indica que el retardo puede fijarse en cualquier múltiplo de 80 ms entre 80 y 1.200, además del valor suelto de 2.400. Los valores de 160, 320, 480 y 960 ms son válidos, pero 1.920 no lo es, así que esa fila debe leerse como una configuración fuera de especificación y no como una degradación del modelo.</w:t>
+      </w:r>
+    </w:p>
+    <w:p>
+      <w:r>
+        <w:t>Los tres truncamientos de 320 ms, en cambio, se dan con un valor admitido y no tienen explicación por ahora. El problema se concentra en cuatro audios concretos y no sigue un patrón claro: la configuración de 320 ms trunca más que la de 160 ms, y la de 960 ms no trunca ninguno. Un mismo audio puede transcribirse bien con 480 y 960 ms y truncarse con 160 y 320 ms. Queda pendiente averiguar el motivo.</w:t>
       </w:r>
     </w:p>
     <w:p>

</xml_diff>